<commit_message>
Update backend controllers, user entity, frontend pages/components, and docs; add admin module and docs
</commit_message>
<xml_diff>
--- a/MedMatch Platform - Complete Project Documentation 2025-08-20.docx
+++ b/MedMatch Platform - Complete Project Documentation 2025-08-20.docx
@@ -6571,272 +6571,6 @@
           <w:szCs w:val="22"/>
         </w:rPr>
       </w:pPr>
-    </w:p>
-    <w:p>
-      <w:pPr>
-        <w:spacing w:line="330" w:lineRule="auto"/>
-        <w:rPr>
-          <w:b/>
-          <w:bCs/>
-          <w:lang w:val="en-DE"/>
-        </w:rPr>
-      </w:pPr>
-      <w:r>
-        <w:rPr>
-          <w:rFonts w:ascii="Segoe UI Emoji" w:hAnsi="Segoe UI Emoji" w:cs="Segoe UI Emoji"/>
-          <w:b/>
-          <w:bCs/>
-          <w:lang w:val="en-DE"/>
-        </w:rPr>
-        <w:lastRenderedPageBreak/>
-        <w:t>🔄</w:t>
-      </w:r>
-      <w:r>
-        <w:rPr>
-          <w:b/>
-          <w:bCs/>
-          <w:lang w:val="en-DE"/>
-        </w:rPr>
-        <w:t xml:space="preserve"> Major Architecture Migration (</w:t>
-      </w:r>
-      <w:r>
-        <w:rPr>
-          <w:b/>
-          <w:bCs/>
-          <w:lang w:val="en-DE"/>
-        </w:rPr>
-        <w:t>25.08.</w:t>
-      </w:r>
-      <w:r>
-        <w:rPr>
-          <w:b/>
-          <w:bCs/>
-          <w:lang w:val="en-DE"/>
-        </w:rPr>
-        <w:t>2025)</w:t>
-      </w:r>
-    </w:p>
-    <w:p>
-      <w:pPr>
-        <w:spacing w:line="330" w:lineRule="auto"/>
-        <w:rPr>
-          <w:lang w:val="en-DE"/>
-        </w:rPr>
-      </w:pPr>
-      <w:r>
-        <w:rPr>
-          <w:b/>
-          <w:bCs/>
-          <w:lang w:val="en-DE"/>
-        </w:rPr>
-        <w:t>Database Restructure Completed:</w:t>
-      </w:r>
-    </w:p>
-    <w:p>
-      <w:pPr>
-        <w:numPr>
-          <w:ilvl w:val="0"/>
-          <w:numId w:val="2"/>
-        </w:numPr>
-        <w:spacing w:line="330" w:lineRule="auto"/>
-        <w:rPr>
-          <w:lang w:val="en-DE"/>
-        </w:rPr>
-      </w:pPr>
-      <w:r>
-        <w:rPr>
-          <w:lang w:val="en-DE"/>
-        </w:rPr>
-        <w:t>Migrated from user-based clinic profiles to independent clinic organizations</w:t>
-      </w:r>
-    </w:p>
-    <w:p>
-      <w:pPr>
-        <w:numPr>
-          <w:ilvl w:val="0"/>
-          <w:numId w:val="2"/>
-        </w:numPr>
-        <w:spacing w:line="330" w:lineRule="auto"/>
-        <w:rPr>
-          <w:lang w:val="en-DE"/>
-        </w:rPr>
-      </w:pPr>
-      <w:r>
-        <w:rPr>
-          <w:lang w:val="en-DE"/>
-        </w:rPr>
-        <w:t>Unified student profiles into universal user profiles system</w:t>
-      </w:r>
-    </w:p>
-    <w:p>
-      <w:pPr>
-        <w:numPr>
-          <w:ilvl w:val="0"/>
-          <w:numId w:val="2"/>
-        </w:numPr>
-        <w:spacing w:line="330" w:lineRule="auto"/>
-        <w:rPr>
-          <w:lang w:val="en-DE"/>
-        </w:rPr>
-      </w:pPr>
-      <w:r>
-        <w:rPr>
-          <w:lang w:val="en-DE"/>
-        </w:rPr>
-        <w:t xml:space="preserve">Enhanced role system with </w:t>
-      </w:r>
-      <w:proofErr w:type="spellStart"/>
-      <w:r>
-        <w:rPr>
-          <w:lang w:val="en-DE"/>
-        </w:rPr>
-        <w:t>clinic_admin</w:t>
-      </w:r>
-      <w:proofErr w:type="spellEnd"/>
-      <w:r>
-        <w:rPr>
-          <w:lang w:val="en-DE"/>
-        </w:rPr>
-        <w:t xml:space="preserve"> and </w:t>
-      </w:r>
-      <w:proofErr w:type="spellStart"/>
-      <w:r>
-        <w:rPr>
-          <w:lang w:val="en-DE"/>
-        </w:rPr>
-        <w:t>clinic_member</w:t>
-      </w:r>
-      <w:proofErr w:type="spellEnd"/>
-      <w:r>
-        <w:rPr>
-          <w:lang w:val="en-DE"/>
-        </w:rPr>
-        <w:t xml:space="preserve"> roles</w:t>
-      </w:r>
-    </w:p>
-    <w:p>
-      <w:pPr>
-        <w:numPr>
-          <w:ilvl w:val="0"/>
-          <w:numId w:val="2"/>
-        </w:numPr>
-        <w:spacing w:line="330" w:lineRule="auto"/>
-        <w:rPr>
-          <w:lang w:val="en-DE"/>
-        </w:rPr>
-      </w:pPr>
-      <w:r>
-        <w:rPr>
-          <w:lang w:val="en-DE"/>
-        </w:rPr>
-        <w:t>Restructured foreign key relationships for better scalability</w:t>
-      </w:r>
-    </w:p>
-    <w:p>
-      <w:pPr>
-        <w:numPr>
-          <w:ilvl w:val="0"/>
-          <w:numId w:val="2"/>
-        </w:numPr>
-        <w:spacing w:line="330" w:lineRule="auto"/>
-        <w:rPr>
-          <w:lang w:val="en-DE"/>
-        </w:rPr>
-      </w:pPr>
-      <w:r>
-        <w:rPr>
-          <w:lang w:val="en-DE"/>
-        </w:rPr>
-        <w:t>All existing data successfully migrated with zero data loss</w:t>
-      </w:r>
-    </w:p>
-    <w:p>
-      <w:pPr>
-        <w:spacing w:line="330" w:lineRule="auto"/>
-        <w:rPr>
-          <w:lang w:val="en-DE"/>
-        </w:rPr>
-      </w:pPr>
-      <w:r>
-        <w:rPr>
-          <w:b/>
-          <w:bCs/>
-          <w:lang w:val="en-DE"/>
-        </w:rPr>
-        <w:t>Impact on Development:</w:t>
-      </w:r>
-    </w:p>
-    <w:p>
-      <w:pPr>
-        <w:numPr>
-          <w:ilvl w:val="0"/>
-          <w:numId w:val="3"/>
-        </w:numPr>
-        <w:spacing w:line="330" w:lineRule="auto"/>
-        <w:rPr>
-          <w:lang w:val="en-DE"/>
-        </w:rPr>
-      </w:pPr>
-      <w:r>
-        <w:rPr>
-          <w:lang w:val="en-DE"/>
-        </w:rPr>
-        <w:t>Clinics can now have multiple staff members</w:t>
-      </w:r>
-    </w:p>
-    <w:p>
-      <w:pPr>
-        <w:numPr>
-          <w:ilvl w:val="0"/>
-          <w:numId w:val="3"/>
-        </w:numPr>
-        <w:spacing w:line="330" w:lineRule="auto"/>
-        <w:rPr>
-          <w:lang w:val="en-DE"/>
-        </w:rPr>
-      </w:pPr>
-      <w:r>
-        <w:rPr>
-          <w:lang w:val="en-DE"/>
-        </w:rPr>
-        <w:t>Cleaner separation between user data and organizational data</w:t>
-      </w:r>
-    </w:p>
-    <w:p>
-      <w:pPr>
-        <w:numPr>
-          <w:ilvl w:val="0"/>
-          <w:numId w:val="3"/>
-        </w:numPr>
-        <w:spacing w:line="330" w:lineRule="auto"/>
-        <w:rPr>
-          <w:lang w:val="en-DE"/>
-        </w:rPr>
-      </w:pPr>
-      <w:r>
-        <w:rPr>
-          <w:lang w:val="en-DE"/>
-        </w:rPr>
-        <w:t>Enhanced permission system for clinic management</w:t>
-      </w:r>
-    </w:p>
-    <w:p>
-      <w:pPr>
-        <w:numPr>
-          <w:ilvl w:val="0"/>
-          <w:numId w:val="3"/>
-        </w:numPr>
-        <w:spacing w:line="330" w:lineRule="auto"/>
-        <w:rPr>
-          <w:lang w:val="en-DE"/>
-        </w:rPr>
-      </w:pPr>
-      <w:r>
-        <w:rPr>
-          <w:lang w:val="en-DE"/>
-        </w:rPr>
-        <w:t>Foundation laid for future multi-tenant clinic features</w:t>
-      </w:r>
     </w:p>
     <w:p>
       <w:pPr>
@@ -6859,95 +6593,9 @@
 <file path=word/numbering.xml><?xml version="1.0" encoding="utf-8"?>
 <w:numbering xmlns:wpc="http://schemas.microsoft.com/office/word/2010/wordprocessingCanvas" xmlns:cx="http://schemas.microsoft.com/office/drawing/2014/chartex" xmlns:cx1="http://schemas.microsoft.com/office/drawing/2015/9/8/chartex" xmlns:cx2="http://schemas.microsoft.com/office/drawing/2015/10/21/chartex" xmlns:cx3="http://schemas.microsoft.com/office/drawing/2016/5/9/chartex" xmlns:cx4="http://schemas.microsoft.com/office/drawing/2016/5/10/chartex" xmlns:cx5="http://schemas.microsoft.com/office/drawing/2016/5/11/chartex" xmlns:cx6="http://schemas.microsoft.com/office/drawing/2016/5/12/chartex" xmlns:cx7="http://schemas.microsoft.com/office/drawing/2016/5/13/chartex" xmlns:cx8="http://schemas.microsoft.com/office/drawing/2016/5/14/chartex" xmlns:mc="http://schemas.openxmlformats.org/markup-compatibility/2006" xmlns:aink="http://schemas.microsoft.com/office/drawing/2016/ink" xmlns:am3d="http://schemas.microsoft.com/office/drawing/2017/model3d" xmlns:o="urn:schemas-microsoft-com:office:office" xmlns:oel="http://schemas.microsoft.com/office/2019/extlst" xmlns:r="http://schemas.openxmlformats.org/officeDocument/2006/relationships" xmlns:m="http://schemas.openxmlformats.org/officeDocument/2006/math" xmlns:v="urn:schemas-microsoft-com:vml" xmlns:wp14="http://schemas.microsoft.com/office/word/2010/wordprocessingDrawing" xmlns:wp="http://schemas.openxmlformats.org/drawingml/2006/wordprocessingDrawing" xmlns:w10="urn:schemas-microsoft-com:office:word" xmlns:w="http://schemas.openxmlformats.org/wordprocessingml/2006/main" xmlns:w14="http://schemas.microsoft.com/office/word/2010/wordml" xmlns:w15="http://schemas.microsoft.com/office/word/2012/wordml" xmlns:w16cex="http://schemas.microsoft.com/office/word/2018/wordml/cex" xmlns:w16cid="http://schemas.microsoft.com/office/word/2016/wordml/cid" xmlns:w16="http://schemas.microsoft.com/office/word/2018/wordml" xmlns:w16du="http://schemas.microsoft.com/office/word/2023/wordml/word16du" xmlns:w16sdtdh="http://schemas.microsoft.com/office/word/2020/wordml/sdtdatahash" xmlns:w16sdtfl="http://schemas.microsoft.com/office/word/2024/wordml/sdtformatlock" xmlns:w16se="http://schemas.microsoft.com/office/word/2015/wordml/symex" xmlns:wpg="http://schemas.microsoft.com/office/word/2010/wordprocessingGroup" xmlns:wpi="http://schemas.microsoft.com/office/word/2010/wordprocessingInk" xmlns:wne="http://schemas.microsoft.com/office/word/2006/wordml" xmlns:wps="http://schemas.microsoft.com/office/word/2010/wordprocessingShape" mc:Ignorable="w14 w15 w16se w16cid w16 w16cex w16sdtdh w16sdtfl w16du wp14">
   <w:abstractNum w:abstractNumId="0" w15:restartNumberingAfterBreak="0">
-    <w:nsid w:val="0F014AA0"/>
-    <w:multiLevelType w:val="hybridMultilevel"/>
-    <w:tmpl w:val="A6EE8076"/>
-    <w:lvl w:ilvl="0" w:tplc="BA1AEDE4">
-      <w:start w:val="1"/>
-      <w:numFmt w:val="bullet"/>
-      <w:lvlText w:val="●"/>
-      <w:lvlJc w:val="left"/>
-      <w:pPr>
-        <w:ind w:left="720" w:hanging="360"/>
-      </w:pPr>
-    </w:lvl>
-    <w:lvl w:ilvl="1" w:tplc="E2FA3656">
-      <w:start w:val="1"/>
-      <w:numFmt w:val="bullet"/>
-      <w:lvlText w:val="○"/>
-      <w:lvlJc w:val="left"/>
-      <w:pPr>
-        <w:ind w:left="1440" w:hanging="360"/>
-      </w:pPr>
-    </w:lvl>
-    <w:lvl w:ilvl="2" w:tplc="DDA0DF76">
-      <w:start w:val="1"/>
-      <w:numFmt w:val="bullet"/>
-      <w:lvlText w:val="■"/>
-      <w:lvlJc w:val="left"/>
-      <w:pPr>
-        <w:ind w:left="2160" w:hanging="360"/>
-      </w:pPr>
-    </w:lvl>
-    <w:lvl w:ilvl="3" w:tplc="562083AC">
-      <w:start w:val="1"/>
-      <w:numFmt w:val="bullet"/>
-      <w:lvlText w:val="●"/>
-      <w:lvlJc w:val="left"/>
-      <w:pPr>
-        <w:ind w:left="2880" w:hanging="360"/>
-      </w:pPr>
-    </w:lvl>
-    <w:lvl w:ilvl="4" w:tplc="BDD4FEBC">
-      <w:start w:val="1"/>
-      <w:numFmt w:val="bullet"/>
-      <w:lvlText w:val="○"/>
-      <w:lvlJc w:val="left"/>
-      <w:pPr>
-        <w:ind w:left="3600" w:hanging="360"/>
-      </w:pPr>
-    </w:lvl>
-    <w:lvl w:ilvl="5" w:tplc="07BAE59C">
-      <w:start w:val="1"/>
-      <w:numFmt w:val="bullet"/>
-      <w:lvlText w:val="■"/>
-      <w:lvlJc w:val="left"/>
-      <w:pPr>
-        <w:ind w:left="4320" w:hanging="360"/>
-      </w:pPr>
-    </w:lvl>
-    <w:lvl w:ilvl="6" w:tplc="2EBC6DDA">
-      <w:start w:val="1"/>
-      <w:numFmt w:val="bullet"/>
-      <w:lvlText w:val="●"/>
-      <w:lvlJc w:val="left"/>
-      <w:pPr>
-        <w:ind w:left="5040" w:hanging="360"/>
-      </w:pPr>
-    </w:lvl>
-    <w:lvl w:ilvl="7" w:tplc="E7846CEE">
-      <w:start w:val="1"/>
-      <w:numFmt w:val="bullet"/>
-      <w:lvlText w:val="●"/>
-      <w:lvlJc w:val="left"/>
-      <w:pPr>
-        <w:ind w:left="5760" w:hanging="360"/>
-      </w:pPr>
-    </w:lvl>
-    <w:lvl w:ilvl="8" w:tplc="84A4F4FA">
-      <w:start w:val="1"/>
-      <w:numFmt w:val="bullet"/>
-      <w:lvlText w:val="●"/>
-      <w:lvlJc w:val="left"/>
-      <w:pPr>
-        <w:ind w:left="6480" w:hanging="360"/>
-      </w:pPr>
-    </w:lvl>
-  </w:abstractNum>
-  <w:abstractNum w:abstractNumId="1" w15:restartNumberingAfterBreak="0">
-    <w:nsid w:val="3CB945A7"/>
+    <w:nsid w:val="05734556"/>
     <w:multiLevelType w:val="multilevel"/>
-    <w:tmpl w:val="D89EE702"/>
+    <w:tmpl w:val="70283024"/>
     <w:lvl w:ilvl="0">
       <w:start w:val="1"/>
       <w:numFmt w:val="bullet"/>
@@ -7093,10 +6741,96 @@
       </w:rPr>
     </w:lvl>
   </w:abstractNum>
+  <w:abstractNum w:abstractNumId="1" w15:restartNumberingAfterBreak="0">
+    <w:nsid w:val="0F014AA0"/>
+    <w:multiLevelType w:val="hybridMultilevel"/>
+    <w:tmpl w:val="A6EE8076"/>
+    <w:lvl w:ilvl="0" w:tplc="BA1AEDE4">
+      <w:start w:val="1"/>
+      <w:numFmt w:val="bullet"/>
+      <w:lvlText w:val="●"/>
+      <w:lvlJc w:val="left"/>
+      <w:pPr>
+        <w:ind w:left="720" w:hanging="360"/>
+      </w:pPr>
+    </w:lvl>
+    <w:lvl w:ilvl="1" w:tplc="E2FA3656">
+      <w:start w:val="1"/>
+      <w:numFmt w:val="bullet"/>
+      <w:lvlText w:val="○"/>
+      <w:lvlJc w:val="left"/>
+      <w:pPr>
+        <w:ind w:left="1440" w:hanging="360"/>
+      </w:pPr>
+    </w:lvl>
+    <w:lvl w:ilvl="2" w:tplc="DDA0DF76">
+      <w:start w:val="1"/>
+      <w:numFmt w:val="bullet"/>
+      <w:lvlText w:val="■"/>
+      <w:lvlJc w:val="left"/>
+      <w:pPr>
+        <w:ind w:left="2160" w:hanging="360"/>
+      </w:pPr>
+    </w:lvl>
+    <w:lvl w:ilvl="3" w:tplc="562083AC">
+      <w:start w:val="1"/>
+      <w:numFmt w:val="bullet"/>
+      <w:lvlText w:val="●"/>
+      <w:lvlJc w:val="left"/>
+      <w:pPr>
+        <w:ind w:left="2880" w:hanging="360"/>
+      </w:pPr>
+    </w:lvl>
+    <w:lvl w:ilvl="4" w:tplc="BDD4FEBC">
+      <w:start w:val="1"/>
+      <w:numFmt w:val="bullet"/>
+      <w:lvlText w:val="○"/>
+      <w:lvlJc w:val="left"/>
+      <w:pPr>
+        <w:ind w:left="3600" w:hanging="360"/>
+      </w:pPr>
+    </w:lvl>
+    <w:lvl w:ilvl="5" w:tplc="07BAE59C">
+      <w:start w:val="1"/>
+      <w:numFmt w:val="bullet"/>
+      <w:lvlText w:val="■"/>
+      <w:lvlJc w:val="left"/>
+      <w:pPr>
+        <w:ind w:left="4320" w:hanging="360"/>
+      </w:pPr>
+    </w:lvl>
+    <w:lvl w:ilvl="6" w:tplc="2EBC6DDA">
+      <w:start w:val="1"/>
+      <w:numFmt w:val="bullet"/>
+      <w:lvlText w:val="●"/>
+      <w:lvlJc w:val="left"/>
+      <w:pPr>
+        <w:ind w:left="5040" w:hanging="360"/>
+      </w:pPr>
+    </w:lvl>
+    <w:lvl w:ilvl="7" w:tplc="E7846CEE">
+      <w:start w:val="1"/>
+      <w:numFmt w:val="bullet"/>
+      <w:lvlText w:val="●"/>
+      <w:lvlJc w:val="left"/>
+      <w:pPr>
+        <w:ind w:left="5760" w:hanging="360"/>
+      </w:pPr>
+    </w:lvl>
+    <w:lvl w:ilvl="8" w:tplc="84A4F4FA">
+      <w:start w:val="1"/>
+      <w:numFmt w:val="bullet"/>
+      <w:lvlText w:val="●"/>
+      <w:lvlJc w:val="left"/>
+      <w:pPr>
+        <w:ind w:left="6480" w:hanging="360"/>
+      </w:pPr>
+    </w:lvl>
+  </w:abstractNum>
   <w:abstractNum w:abstractNumId="2" w15:restartNumberingAfterBreak="0">
-    <w:nsid w:val="4B751829"/>
+    <w:nsid w:val="26AA0596"/>
     <w:multiLevelType w:val="multilevel"/>
-    <w:tmpl w:val="2C401008"/>
+    <w:tmpl w:val="01A0BEAC"/>
     <w:lvl w:ilvl="0">
       <w:start w:val="1"/>
       <w:numFmt w:val="bullet"/>
@@ -7242,17 +6976,625 @@
       </w:rPr>
     </w:lvl>
   </w:abstractNum>
+  <w:abstractNum w:abstractNumId="3" w15:restartNumberingAfterBreak="0">
+    <w:nsid w:val="3CB945A7"/>
+    <w:multiLevelType w:val="multilevel"/>
+    <w:tmpl w:val="D89EE702"/>
+    <w:lvl w:ilvl="0">
+      <w:start w:val="1"/>
+      <w:numFmt w:val="bullet"/>
+      <w:lvlText w:val=""/>
+      <w:lvlJc w:val="left"/>
+      <w:pPr>
+        <w:tabs>
+          <w:tab w:val="num" w:pos="720"/>
+        </w:tabs>
+        <w:ind w:left="720" w:hanging="360"/>
+      </w:pPr>
+      <w:rPr>
+        <w:rFonts w:ascii="Symbol" w:hAnsi="Symbol" w:hint="default"/>
+        <w:sz w:val="20"/>
+      </w:rPr>
+    </w:lvl>
+    <w:lvl w:ilvl="1" w:tentative="1">
+      <w:start w:val="1"/>
+      <w:numFmt w:val="bullet"/>
+      <w:lvlText w:val="o"/>
+      <w:lvlJc w:val="left"/>
+      <w:pPr>
+        <w:tabs>
+          <w:tab w:val="num" w:pos="1440"/>
+        </w:tabs>
+        <w:ind w:left="1440" w:hanging="360"/>
+      </w:pPr>
+      <w:rPr>
+        <w:rFonts w:ascii="Courier New" w:hAnsi="Courier New" w:hint="default"/>
+        <w:sz w:val="20"/>
+      </w:rPr>
+    </w:lvl>
+    <w:lvl w:ilvl="2" w:tentative="1">
+      <w:start w:val="1"/>
+      <w:numFmt w:val="bullet"/>
+      <w:lvlText w:val=""/>
+      <w:lvlJc w:val="left"/>
+      <w:pPr>
+        <w:tabs>
+          <w:tab w:val="num" w:pos="2160"/>
+        </w:tabs>
+        <w:ind w:left="2160" w:hanging="360"/>
+      </w:pPr>
+      <w:rPr>
+        <w:rFonts w:ascii="Wingdings" w:hAnsi="Wingdings" w:hint="default"/>
+        <w:sz w:val="20"/>
+      </w:rPr>
+    </w:lvl>
+    <w:lvl w:ilvl="3" w:tentative="1">
+      <w:start w:val="1"/>
+      <w:numFmt w:val="bullet"/>
+      <w:lvlText w:val=""/>
+      <w:lvlJc w:val="left"/>
+      <w:pPr>
+        <w:tabs>
+          <w:tab w:val="num" w:pos="2880"/>
+        </w:tabs>
+        <w:ind w:left="2880" w:hanging="360"/>
+      </w:pPr>
+      <w:rPr>
+        <w:rFonts w:ascii="Wingdings" w:hAnsi="Wingdings" w:hint="default"/>
+        <w:sz w:val="20"/>
+      </w:rPr>
+    </w:lvl>
+    <w:lvl w:ilvl="4" w:tentative="1">
+      <w:start w:val="1"/>
+      <w:numFmt w:val="bullet"/>
+      <w:lvlText w:val=""/>
+      <w:lvlJc w:val="left"/>
+      <w:pPr>
+        <w:tabs>
+          <w:tab w:val="num" w:pos="3600"/>
+        </w:tabs>
+        <w:ind w:left="3600" w:hanging="360"/>
+      </w:pPr>
+      <w:rPr>
+        <w:rFonts w:ascii="Wingdings" w:hAnsi="Wingdings" w:hint="default"/>
+        <w:sz w:val="20"/>
+      </w:rPr>
+    </w:lvl>
+    <w:lvl w:ilvl="5" w:tentative="1">
+      <w:start w:val="1"/>
+      <w:numFmt w:val="bullet"/>
+      <w:lvlText w:val=""/>
+      <w:lvlJc w:val="left"/>
+      <w:pPr>
+        <w:tabs>
+          <w:tab w:val="num" w:pos="4320"/>
+        </w:tabs>
+        <w:ind w:left="4320" w:hanging="360"/>
+      </w:pPr>
+      <w:rPr>
+        <w:rFonts w:ascii="Wingdings" w:hAnsi="Wingdings" w:hint="default"/>
+        <w:sz w:val="20"/>
+      </w:rPr>
+    </w:lvl>
+    <w:lvl w:ilvl="6" w:tentative="1">
+      <w:start w:val="1"/>
+      <w:numFmt w:val="bullet"/>
+      <w:lvlText w:val=""/>
+      <w:lvlJc w:val="left"/>
+      <w:pPr>
+        <w:tabs>
+          <w:tab w:val="num" w:pos="5040"/>
+        </w:tabs>
+        <w:ind w:left="5040" w:hanging="360"/>
+      </w:pPr>
+      <w:rPr>
+        <w:rFonts w:ascii="Wingdings" w:hAnsi="Wingdings" w:hint="default"/>
+        <w:sz w:val="20"/>
+      </w:rPr>
+    </w:lvl>
+    <w:lvl w:ilvl="7" w:tentative="1">
+      <w:start w:val="1"/>
+      <w:numFmt w:val="bullet"/>
+      <w:lvlText w:val=""/>
+      <w:lvlJc w:val="left"/>
+      <w:pPr>
+        <w:tabs>
+          <w:tab w:val="num" w:pos="5760"/>
+        </w:tabs>
+        <w:ind w:left="5760" w:hanging="360"/>
+      </w:pPr>
+      <w:rPr>
+        <w:rFonts w:ascii="Wingdings" w:hAnsi="Wingdings" w:hint="default"/>
+        <w:sz w:val="20"/>
+      </w:rPr>
+    </w:lvl>
+    <w:lvl w:ilvl="8" w:tentative="1">
+      <w:start w:val="1"/>
+      <w:numFmt w:val="bullet"/>
+      <w:lvlText w:val=""/>
+      <w:lvlJc w:val="left"/>
+      <w:pPr>
+        <w:tabs>
+          <w:tab w:val="num" w:pos="6480"/>
+        </w:tabs>
+        <w:ind w:left="6480" w:hanging="360"/>
+      </w:pPr>
+      <w:rPr>
+        <w:rFonts w:ascii="Wingdings" w:hAnsi="Wingdings" w:hint="default"/>
+        <w:sz w:val="20"/>
+      </w:rPr>
+    </w:lvl>
+  </w:abstractNum>
+  <w:abstractNum w:abstractNumId="4" w15:restartNumberingAfterBreak="0">
+    <w:nsid w:val="4B751829"/>
+    <w:multiLevelType w:val="multilevel"/>
+    <w:tmpl w:val="2C401008"/>
+    <w:lvl w:ilvl="0">
+      <w:start w:val="1"/>
+      <w:numFmt w:val="bullet"/>
+      <w:lvlText w:val=""/>
+      <w:lvlJc w:val="left"/>
+      <w:pPr>
+        <w:tabs>
+          <w:tab w:val="num" w:pos="720"/>
+        </w:tabs>
+        <w:ind w:left="720" w:hanging="360"/>
+      </w:pPr>
+      <w:rPr>
+        <w:rFonts w:ascii="Symbol" w:hAnsi="Symbol" w:hint="default"/>
+        <w:sz w:val="20"/>
+      </w:rPr>
+    </w:lvl>
+    <w:lvl w:ilvl="1" w:tentative="1">
+      <w:start w:val="1"/>
+      <w:numFmt w:val="bullet"/>
+      <w:lvlText w:val="o"/>
+      <w:lvlJc w:val="left"/>
+      <w:pPr>
+        <w:tabs>
+          <w:tab w:val="num" w:pos="1440"/>
+        </w:tabs>
+        <w:ind w:left="1440" w:hanging="360"/>
+      </w:pPr>
+      <w:rPr>
+        <w:rFonts w:ascii="Courier New" w:hAnsi="Courier New" w:hint="default"/>
+        <w:sz w:val="20"/>
+      </w:rPr>
+    </w:lvl>
+    <w:lvl w:ilvl="2" w:tentative="1">
+      <w:start w:val="1"/>
+      <w:numFmt w:val="bullet"/>
+      <w:lvlText w:val=""/>
+      <w:lvlJc w:val="left"/>
+      <w:pPr>
+        <w:tabs>
+          <w:tab w:val="num" w:pos="2160"/>
+        </w:tabs>
+        <w:ind w:left="2160" w:hanging="360"/>
+      </w:pPr>
+      <w:rPr>
+        <w:rFonts w:ascii="Wingdings" w:hAnsi="Wingdings" w:hint="default"/>
+        <w:sz w:val="20"/>
+      </w:rPr>
+    </w:lvl>
+    <w:lvl w:ilvl="3" w:tentative="1">
+      <w:start w:val="1"/>
+      <w:numFmt w:val="bullet"/>
+      <w:lvlText w:val=""/>
+      <w:lvlJc w:val="left"/>
+      <w:pPr>
+        <w:tabs>
+          <w:tab w:val="num" w:pos="2880"/>
+        </w:tabs>
+        <w:ind w:left="2880" w:hanging="360"/>
+      </w:pPr>
+      <w:rPr>
+        <w:rFonts w:ascii="Wingdings" w:hAnsi="Wingdings" w:hint="default"/>
+        <w:sz w:val="20"/>
+      </w:rPr>
+    </w:lvl>
+    <w:lvl w:ilvl="4" w:tentative="1">
+      <w:start w:val="1"/>
+      <w:numFmt w:val="bullet"/>
+      <w:lvlText w:val=""/>
+      <w:lvlJc w:val="left"/>
+      <w:pPr>
+        <w:tabs>
+          <w:tab w:val="num" w:pos="3600"/>
+        </w:tabs>
+        <w:ind w:left="3600" w:hanging="360"/>
+      </w:pPr>
+      <w:rPr>
+        <w:rFonts w:ascii="Wingdings" w:hAnsi="Wingdings" w:hint="default"/>
+        <w:sz w:val="20"/>
+      </w:rPr>
+    </w:lvl>
+    <w:lvl w:ilvl="5" w:tentative="1">
+      <w:start w:val="1"/>
+      <w:numFmt w:val="bullet"/>
+      <w:lvlText w:val=""/>
+      <w:lvlJc w:val="left"/>
+      <w:pPr>
+        <w:tabs>
+          <w:tab w:val="num" w:pos="4320"/>
+        </w:tabs>
+        <w:ind w:left="4320" w:hanging="360"/>
+      </w:pPr>
+      <w:rPr>
+        <w:rFonts w:ascii="Wingdings" w:hAnsi="Wingdings" w:hint="default"/>
+        <w:sz w:val="20"/>
+      </w:rPr>
+    </w:lvl>
+    <w:lvl w:ilvl="6" w:tentative="1">
+      <w:start w:val="1"/>
+      <w:numFmt w:val="bullet"/>
+      <w:lvlText w:val=""/>
+      <w:lvlJc w:val="left"/>
+      <w:pPr>
+        <w:tabs>
+          <w:tab w:val="num" w:pos="5040"/>
+        </w:tabs>
+        <w:ind w:left="5040" w:hanging="360"/>
+      </w:pPr>
+      <w:rPr>
+        <w:rFonts w:ascii="Wingdings" w:hAnsi="Wingdings" w:hint="default"/>
+        <w:sz w:val="20"/>
+      </w:rPr>
+    </w:lvl>
+    <w:lvl w:ilvl="7" w:tentative="1">
+      <w:start w:val="1"/>
+      <w:numFmt w:val="bullet"/>
+      <w:lvlText w:val=""/>
+      <w:lvlJc w:val="left"/>
+      <w:pPr>
+        <w:tabs>
+          <w:tab w:val="num" w:pos="5760"/>
+        </w:tabs>
+        <w:ind w:left="5760" w:hanging="360"/>
+      </w:pPr>
+      <w:rPr>
+        <w:rFonts w:ascii="Wingdings" w:hAnsi="Wingdings" w:hint="default"/>
+        <w:sz w:val="20"/>
+      </w:rPr>
+    </w:lvl>
+    <w:lvl w:ilvl="8" w:tentative="1">
+      <w:start w:val="1"/>
+      <w:numFmt w:val="bullet"/>
+      <w:lvlText w:val=""/>
+      <w:lvlJc w:val="left"/>
+      <w:pPr>
+        <w:tabs>
+          <w:tab w:val="num" w:pos="6480"/>
+        </w:tabs>
+        <w:ind w:left="6480" w:hanging="360"/>
+      </w:pPr>
+      <w:rPr>
+        <w:rFonts w:ascii="Wingdings" w:hAnsi="Wingdings" w:hint="default"/>
+        <w:sz w:val="20"/>
+      </w:rPr>
+    </w:lvl>
+  </w:abstractNum>
+  <w:abstractNum w:abstractNumId="5" w15:restartNumberingAfterBreak="0">
+    <w:nsid w:val="4BE3791E"/>
+    <w:multiLevelType w:val="multilevel"/>
+    <w:tmpl w:val="6E7E7906"/>
+    <w:lvl w:ilvl="0">
+      <w:start w:val="1"/>
+      <w:numFmt w:val="bullet"/>
+      <w:lvlText w:val=""/>
+      <w:lvlJc w:val="left"/>
+      <w:pPr>
+        <w:tabs>
+          <w:tab w:val="num" w:pos="720"/>
+        </w:tabs>
+        <w:ind w:left="720" w:hanging="360"/>
+      </w:pPr>
+      <w:rPr>
+        <w:rFonts w:ascii="Symbol" w:hAnsi="Symbol" w:hint="default"/>
+        <w:sz w:val="20"/>
+      </w:rPr>
+    </w:lvl>
+    <w:lvl w:ilvl="1" w:tentative="1">
+      <w:start w:val="1"/>
+      <w:numFmt w:val="bullet"/>
+      <w:lvlText w:val="o"/>
+      <w:lvlJc w:val="left"/>
+      <w:pPr>
+        <w:tabs>
+          <w:tab w:val="num" w:pos="1440"/>
+        </w:tabs>
+        <w:ind w:left="1440" w:hanging="360"/>
+      </w:pPr>
+      <w:rPr>
+        <w:rFonts w:ascii="Courier New" w:hAnsi="Courier New" w:hint="default"/>
+        <w:sz w:val="20"/>
+      </w:rPr>
+    </w:lvl>
+    <w:lvl w:ilvl="2" w:tentative="1">
+      <w:start w:val="1"/>
+      <w:numFmt w:val="bullet"/>
+      <w:lvlText w:val=""/>
+      <w:lvlJc w:val="left"/>
+      <w:pPr>
+        <w:tabs>
+          <w:tab w:val="num" w:pos="2160"/>
+        </w:tabs>
+        <w:ind w:left="2160" w:hanging="360"/>
+      </w:pPr>
+      <w:rPr>
+        <w:rFonts w:ascii="Wingdings" w:hAnsi="Wingdings" w:hint="default"/>
+        <w:sz w:val="20"/>
+      </w:rPr>
+    </w:lvl>
+    <w:lvl w:ilvl="3" w:tentative="1">
+      <w:start w:val="1"/>
+      <w:numFmt w:val="bullet"/>
+      <w:lvlText w:val=""/>
+      <w:lvlJc w:val="left"/>
+      <w:pPr>
+        <w:tabs>
+          <w:tab w:val="num" w:pos="2880"/>
+        </w:tabs>
+        <w:ind w:left="2880" w:hanging="360"/>
+      </w:pPr>
+      <w:rPr>
+        <w:rFonts w:ascii="Wingdings" w:hAnsi="Wingdings" w:hint="default"/>
+        <w:sz w:val="20"/>
+      </w:rPr>
+    </w:lvl>
+    <w:lvl w:ilvl="4" w:tentative="1">
+      <w:start w:val="1"/>
+      <w:numFmt w:val="bullet"/>
+      <w:lvlText w:val=""/>
+      <w:lvlJc w:val="left"/>
+      <w:pPr>
+        <w:tabs>
+          <w:tab w:val="num" w:pos="3600"/>
+        </w:tabs>
+        <w:ind w:left="3600" w:hanging="360"/>
+      </w:pPr>
+      <w:rPr>
+        <w:rFonts w:ascii="Wingdings" w:hAnsi="Wingdings" w:hint="default"/>
+        <w:sz w:val="20"/>
+      </w:rPr>
+    </w:lvl>
+    <w:lvl w:ilvl="5" w:tentative="1">
+      <w:start w:val="1"/>
+      <w:numFmt w:val="bullet"/>
+      <w:lvlText w:val=""/>
+      <w:lvlJc w:val="left"/>
+      <w:pPr>
+        <w:tabs>
+          <w:tab w:val="num" w:pos="4320"/>
+        </w:tabs>
+        <w:ind w:left="4320" w:hanging="360"/>
+      </w:pPr>
+      <w:rPr>
+        <w:rFonts w:ascii="Wingdings" w:hAnsi="Wingdings" w:hint="default"/>
+        <w:sz w:val="20"/>
+      </w:rPr>
+    </w:lvl>
+    <w:lvl w:ilvl="6" w:tentative="1">
+      <w:start w:val="1"/>
+      <w:numFmt w:val="bullet"/>
+      <w:lvlText w:val=""/>
+      <w:lvlJc w:val="left"/>
+      <w:pPr>
+        <w:tabs>
+          <w:tab w:val="num" w:pos="5040"/>
+        </w:tabs>
+        <w:ind w:left="5040" w:hanging="360"/>
+      </w:pPr>
+      <w:rPr>
+        <w:rFonts w:ascii="Wingdings" w:hAnsi="Wingdings" w:hint="default"/>
+        <w:sz w:val="20"/>
+      </w:rPr>
+    </w:lvl>
+    <w:lvl w:ilvl="7" w:tentative="1">
+      <w:start w:val="1"/>
+      <w:numFmt w:val="bullet"/>
+      <w:lvlText w:val=""/>
+      <w:lvlJc w:val="left"/>
+      <w:pPr>
+        <w:tabs>
+          <w:tab w:val="num" w:pos="5760"/>
+        </w:tabs>
+        <w:ind w:left="5760" w:hanging="360"/>
+      </w:pPr>
+      <w:rPr>
+        <w:rFonts w:ascii="Wingdings" w:hAnsi="Wingdings" w:hint="default"/>
+        <w:sz w:val="20"/>
+      </w:rPr>
+    </w:lvl>
+    <w:lvl w:ilvl="8" w:tentative="1">
+      <w:start w:val="1"/>
+      <w:numFmt w:val="bullet"/>
+      <w:lvlText w:val=""/>
+      <w:lvlJc w:val="left"/>
+      <w:pPr>
+        <w:tabs>
+          <w:tab w:val="num" w:pos="6480"/>
+        </w:tabs>
+        <w:ind w:left="6480" w:hanging="360"/>
+      </w:pPr>
+      <w:rPr>
+        <w:rFonts w:ascii="Wingdings" w:hAnsi="Wingdings" w:hint="default"/>
+        <w:sz w:val="20"/>
+      </w:rPr>
+    </w:lvl>
+  </w:abstractNum>
+  <w:abstractNum w:abstractNumId="6" w15:restartNumberingAfterBreak="0">
+    <w:nsid w:val="6CE55956"/>
+    <w:multiLevelType w:val="multilevel"/>
+    <w:tmpl w:val="FD9CD3E0"/>
+    <w:lvl w:ilvl="0">
+      <w:start w:val="1"/>
+      <w:numFmt w:val="bullet"/>
+      <w:lvlText w:val=""/>
+      <w:lvlJc w:val="left"/>
+      <w:pPr>
+        <w:tabs>
+          <w:tab w:val="num" w:pos="720"/>
+        </w:tabs>
+        <w:ind w:left="720" w:hanging="360"/>
+      </w:pPr>
+      <w:rPr>
+        <w:rFonts w:ascii="Symbol" w:hAnsi="Symbol" w:hint="default"/>
+        <w:sz w:val="20"/>
+      </w:rPr>
+    </w:lvl>
+    <w:lvl w:ilvl="1" w:tentative="1">
+      <w:start w:val="1"/>
+      <w:numFmt w:val="bullet"/>
+      <w:lvlText w:val="o"/>
+      <w:lvlJc w:val="left"/>
+      <w:pPr>
+        <w:tabs>
+          <w:tab w:val="num" w:pos="1440"/>
+        </w:tabs>
+        <w:ind w:left="1440" w:hanging="360"/>
+      </w:pPr>
+      <w:rPr>
+        <w:rFonts w:ascii="Courier New" w:hAnsi="Courier New" w:hint="default"/>
+        <w:sz w:val="20"/>
+      </w:rPr>
+    </w:lvl>
+    <w:lvl w:ilvl="2" w:tentative="1">
+      <w:start w:val="1"/>
+      <w:numFmt w:val="bullet"/>
+      <w:lvlText w:val=""/>
+      <w:lvlJc w:val="left"/>
+      <w:pPr>
+        <w:tabs>
+          <w:tab w:val="num" w:pos="2160"/>
+        </w:tabs>
+        <w:ind w:left="2160" w:hanging="360"/>
+      </w:pPr>
+      <w:rPr>
+        <w:rFonts w:ascii="Wingdings" w:hAnsi="Wingdings" w:hint="default"/>
+        <w:sz w:val="20"/>
+      </w:rPr>
+    </w:lvl>
+    <w:lvl w:ilvl="3" w:tentative="1">
+      <w:start w:val="1"/>
+      <w:numFmt w:val="bullet"/>
+      <w:lvlText w:val=""/>
+      <w:lvlJc w:val="left"/>
+      <w:pPr>
+        <w:tabs>
+          <w:tab w:val="num" w:pos="2880"/>
+        </w:tabs>
+        <w:ind w:left="2880" w:hanging="360"/>
+      </w:pPr>
+      <w:rPr>
+        <w:rFonts w:ascii="Wingdings" w:hAnsi="Wingdings" w:hint="default"/>
+        <w:sz w:val="20"/>
+      </w:rPr>
+    </w:lvl>
+    <w:lvl w:ilvl="4" w:tentative="1">
+      <w:start w:val="1"/>
+      <w:numFmt w:val="bullet"/>
+      <w:lvlText w:val=""/>
+      <w:lvlJc w:val="left"/>
+      <w:pPr>
+        <w:tabs>
+          <w:tab w:val="num" w:pos="3600"/>
+        </w:tabs>
+        <w:ind w:left="3600" w:hanging="360"/>
+      </w:pPr>
+      <w:rPr>
+        <w:rFonts w:ascii="Wingdings" w:hAnsi="Wingdings" w:hint="default"/>
+        <w:sz w:val="20"/>
+      </w:rPr>
+    </w:lvl>
+    <w:lvl w:ilvl="5" w:tentative="1">
+      <w:start w:val="1"/>
+      <w:numFmt w:val="bullet"/>
+      <w:lvlText w:val=""/>
+      <w:lvlJc w:val="left"/>
+      <w:pPr>
+        <w:tabs>
+          <w:tab w:val="num" w:pos="4320"/>
+        </w:tabs>
+        <w:ind w:left="4320" w:hanging="360"/>
+      </w:pPr>
+      <w:rPr>
+        <w:rFonts w:ascii="Wingdings" w:hAnsi="Wingdings" w:hint="default"/>
+        <w:sz w:val="20"/>
+      </w:rPr>
+    </w:lvl>
+    <w:lvl w:ilvl="6" w:tentative="1">
+      <w:start w:val="1"/>
+      <w:numFmt w:val="bullet"/>
+      <w:lvlText w:val=""/>
+      <w:lvlJc w:val="left"/>
+      <w:pPr>
+        <w:tabs>
+          <w:tab w:val="num" w:pos="5040"/>
+        </w:tabs>
+        <w:ind w:left="5040" w:hanging="360"/>
+      </w:pPr>
+      <w:rPr>
+        <w:rFonts w:ascii="Wingdings" w:hAnsi="Wingdings" w:hint="default"/>
+        <w:sz w:val="20"/>
+      </w:rPr>
+    </w:lvl>
+    <w:lvl w:ilvl="7" w:tentative="1">
+      <w:start w:val="1"/>
+      <w:numFmt w:val="bullet"/>
+      <w:lvlText w:val=""/>
+      <w:lvlJc w:val="left"/>
+      <w:pPr>
+        <w:tabs>
+          <w:tab w:val="num" w:pos="5760"/>
+        </w:tabs>
+        <w:ind w:left="5760" w:hanging="360"/>
+      </w:pPr>
+      <w:rPr>
+        <w:rFonts w:ascii="Wingdings" w:hAnsi="Wingdings" w:hint="default"/>
+        <w:sz w:val="20"/>
+      </w:rPr>
+    </w:lvl>
+    <w:lvl w:ilvl="8" w:tentative="1">
+      <w:start w:val="1"/>
+      <w:numFmt w:val="bullet"/>
+      <w:lvlText w:val=""/>
+      <w:lvlJc w:val="left"/>
+      <w:pPr>
+        <w:tabs>
+          <w:tab w:val="num" w:pos="6480"/>
+        </w:tabs>
+        <w:ind w:left="6480" w:hanging="360"/>
+      </w:pPr>
+      <w:rPr>
+        <w:rFonts w:ascii="Wingdings" w:hAnsi="Wingdings" w:hint="default"/>
+        <w:sz w:val="20"/>
+      </w:rPr>
+    </w:lvl>
+  </w:abstractNum>
   <w:num w:numId="1" w16cid:durableId="1035813766">
-    <w:abstractNumId w:val="0"/>
+    <w:abstractNumId w:val="1"/>
     <w:lvlOverride w:ilvl="0">
       <w:startOverride w:val="1"/>
     </w:lvlOverride>
   </w:num>
   <w:num w:numId="2" w16cid:durableId="547762750">
+    <w:abstractNumId w:val="4"/>
+  </w:num>
+  <w:num w:numId="3" w16cid:durableId="1886944592">
+    <w:abstractNumId w:val="3"/>
+  </w:num>
+  <w:num w:numId="4" w16cid:durableId="1023702163">
     <w:abstractNumId w:val="2"/>
   </w:num>
-  <w:num w:numId="3" w16cid:durableId="1886944592">
-    <w:abstractNumId w:val="1"/>
+  <w:num w:numId="5" w16cid:durableId="1640454576">
+    <w:abstractNumId w:val="6"/>
+  </w:num>
+  <w:num w:numId="6" w16cid:durableId="285042529">
+    <w:abstractNumId w:val="0"/>
+  </w:num>
+  <w:num w:numId="7" w16cid:durableId="521479018">
+    <w:abstractNumId w:val="5"/>
   </w:num>
 </w:numbering>
 </file>

</xml_diff>